<commit_message>
docs: expand experiment 2 figure analysis and improve pagination
</commit_message>
<xml_diff>
--- a/docs/experiment2/实验2报告_标准模板版.docx
+++ b/docs/experiment2/实验2报告_标准模板版.docx
@@ -1195,6 +1195,32 @@
               <w:t>实验数据及结果分析：</w:t>
             </w:r>
           </w:p>
+          <w:p>
+            <w:pPr>
+              <w:spacing w:after="120" w:line="300" w:lineRule="auto"/>
+            </w:pPr>
+            <w:r>
+              <w:rPr>
+                <w:rFonts w:ascii="宋体" w:hAnsi="宋体" w:eastAsia="宋体"/>
+                <w:b w:val="0"/>
+                <w:sz w:val="28"/>
+              </w:rPr>
+              <w:t>以下五张图按 Git 版本的先后顺序排列。前两张记录代码结构的变化，第三张核对原有用例，最后两张对照 F 指令实现前后的运行结果。每一步都在前一步的基础上完成，便于检查哪次修改引起了测试结果变化。</w:t>
+            </w:r>
+          </w:p>
+          <w:p>
+            <w:pPr>
+              <w:spacing w:after="120" w:line="300" w:lineRule="auto"/>
+            </w:pPr>
+            <w:r>
+              <w:rPr>
+                <w:rFonts w:ascii="宋体" w:hAnsi="宋体" w:eastAsia="宋体"/>
+                <w:b w:val="0"/>
+                <w:sz w:val="28"/>
+              </w:rPr>
+              <w:t>原有 14 项用例覆盖初始位姿、四个方向的前进、左右转向、组合命令和空命令。新增 4 项用例分别检查加速前进、加速左转、加速右转以及 F 的关闭与再次开启。下文结合截图说明代码与测试结果。</w:t>
+            </w:r>
+          </w:p>
           <w:tbl>
             <w:tblPr>
               <w:tblW w:type="auto" w:w="0"/>
@@ -1214,7 +1240,7 @@
                 </w:tcPr>
                 <w:p>
                   <w:pPr>
-                    <w:spacing w:after="120"/>
+                    <w:spacing w:after="160"/>
                     <w:jc w:val="center"/>
                   </w:pPr>
                   <w:r>
@@ -1228,8 +1254,8 @@
                 </w:p>
                 <w:p>
                   <w:pPr>
-                    <w:spacing w:after="120"/>
-                    <w:jc w:val="center"/>
+                    <w:spacing w:after="120" w:line="288" w:lineRule="auto"/>
+                    <w:jc w:val="left"/>
                   </w:pPr>
                   <w:r>
                     <w:rPr>
@@ -1237,18 +1263,32 @@
                       <w:b w:val="0"/>
                       <w:sz w:val="28"/>
                     </w:rPr>
-                    <w:t>Move、TurnLeft、TurnRight 分别负责位移和方向变化，Execute 只按 M/L/R 分派。原有 14 项用例通过。</w:t>
+                    <w:t>修改内容：把原来写在 Execute 中的坐标变化和方向变化分别移入 Move、TurnLeft、TurnRight。Move 根据朝向改变 x 或 y；两个转向函数只改变 heading。Execute 保留对 M、L、R 的识别，再调用对应方法。图中可看到头文件里的三个声明及 Execute 的调用位置。</w:t>
                   </w:r>
                 </w:p>
                 <w:p>
                   <w:pPr>
-                    <w:spacing w:after="240"/>
+                    <w:spacing w:after="120" w:line="288" w:lineRule="auto"/>
+                    <w:jc w:val="left"/>
+                  </w:pPr>
+                  <w:r>
+                    <w:rPr>
+                      <w:rFonts w:ascii="宋体" w:hAnsi="宋体" w:eastAsia="宋体"/>
+                      <w:b w:val="0"/>
+                      <w:sz w:val="28"/>
+                    </w:rPr>
+                    <w:t>结果分析：这一步没有增加新指令，也没有改变对外接口。重新运行原有 14 项用例后均通过，说明函数抽取保留了原来的移动和转向结果。后续指令类可以直接调用这些方法。对应版本为 exp2-functions（00cbc3b）。</w:t>
+                  </w:r>
+                </w:p>
+                <w:p>
+                  <w:pPr>
+                    <w:spacing w:after="160"/>
                     <w:jc w:val="center"/>
                   </w:pPr>
                   <w:r>
                     <w:drawing>
                       <wp:inline xmlns:a="http://schemas.openxmlformats.org/drawingml/2006/main" xmlns:pic="http://schemas.openxmlformats.org/drawingml/2006/picture">
-                        <wp:extent cx="4709160" cy="2943570"/>
+                        <wp:extent cx="4800600" cy="3000727"/>
                         <wp:docPr id="1" name="Picture 1"/>
                         <wp:cNvGraphicFramePr>
                           <a:graphicFrameLocks noChangeAspect="1"/>
@@ -1269,7 +1309,7 @@
                               <pic:spPr>
                                 <a:xfrm>
                                   <a:off x="0" y="0"/>
-                                  <a:ext cx="4709160" cy="2943570"/>
+                                  <a:ext cx="4800600" cy="3000727"/>
                                 </a:xfrm>
                                 <a:prstGeom prst="rect"/>
                               </pic:spPr>
@@ -1303,7 +1343,7 @@
                 </w:tcPr>
                 <w:p>
                   <w:pPr>
-                    <w:spacing w:after="120"/>
+                    <w:spacing w:after="160"/>
                     <w:jc w:val="center"/>
                   </w:pPr>
                   <w:r>
@@ -1317,8 +1357,8 @@
                 </w:p>
                 <w:p>
                   <w:pPr>
-                    <w:spacing w:after="120"/>
-                    <w:jc w:val="center"/>
+                    <w:spacing w:after="120" w:line="288" w:lineRule="auto"/>
+                    <w:jc w:val="left"/>
                   </w:pPr>
                   <w:r>
                     <w:rPr>
@@ -1326,18 +1366,32 @@
                       <w:b w:val="0"/>
                       <w:sz w:val="28"/>
                     </w:rPr>
-                    <w:t>三个指令类封装对应操作，Execute 创建对象并调用 DoOperate。原有 14 项用例通过。</w:t>
+                    <w:t>修改内容：增加 MoveCommand、TurnLeftCommand、TurnRightCommand 三个类。每个类都提供 DoOperate，并在函数中调用对应的 Move、TurnLeft 或 TurnRight；Execute 根据读到的字符创建相应对象并执行操作。图中三个类的定义与下方的分派代码相互对应。</w:t>
                   </w:r>
                 </w:p>
                 <w:p>
                   <w:pPr>
-                    <w:spacing w:after="240"/>
+                    <w:spacing w:after="120" w:line="288" w:lineRule="auto"/>
+                    <w:jc w:val="left"/>
+                  </w:pPr>
+                  <w:r>
+                    <w:rPr>
+                      <w:rFonts w:ascii="宋体" w:hAnsi="宋体" w:eastAsia="宋体"/>
+                      <w:b w:val="0"/>
+                      <w:sz w:val="28"/>
+                    </w:rPr>
+                    <w:t>结果分析：位移与转向的具体规则仍由上一步抽出的函数负责，指令类负责把一种字符操作封装为一个对象。该阶段的三个类尚未继承共同接口，原有 14 项测试仍通过，说明类封装没有改变 M、L、R 的执行结果。对应版本为 exp2-classes（f35adc7）。</w:t>
+                  </w:r>
+                </w:p>
+                <w:p>
+                  <w:pPr>
+                    <w:spacing w:after="160"/>
                     <w:jc w:val="center"/>
                   </w:pPr>
                   <w:r>
                     <w:drawing>
                       <wp:inline xmlns:a="http://schemas.openxmlformats.org/drawingml/2006/main" xmlns:pic="http://schemas.openxmlformats.org/drawingml/2006/picture">
-                        <wp:extent cx="4709160" cy="2943570"/>
+                        <wp:extent cx="4800600" cy="3000727"/>
                         <wp:docPr id="2" name="Picture 2"/>
                         <wp:cNvGraphicFramePr>
                           <a:graphicFrameLocks noChangeAspect="1"/>
@@ -1358,7 +1412,7 @@
                               <pic:spPr>
                                 <a:xfrm>
                                   <a:off x="0" y="0"/>
-                                  <a:ext cx="4709160" cy="2943570"/>
+                                  <a:ext cx="4800600" cy="3000727"/>
                                 </a:xfrm>
                                 <a:prstGeom prst="rect"/>
                               </pic:spPr>
@@ -1392,7 +1446,7 @@
                 </w:tcPr>
                 <w:p>
                   <w:pPr>
-                    <w:spacing w:after="120"/>
+                    <w:spacing w:after="160"/>
                     <w:jc w:val="center"/>
                   </w:pPr>
                   <w:r>
@@ -1406,8 +1460,8 @@
                 </w:p>
                 <w:p>
                   <w:pPr>
-                    <w:spacing w:after="120"/>
-                    <w:jc w:val="center"/>
+                    <w:spacing w:after="120" w:line="288" w:lineRule="auto"/>
+                    <w:jc w:val="left"/>
                   </w:pPr>
                   <w:r>
                     <w:rPr>
@@ -1415,18 +1469,32 @@
                       <w:b w:val="0"/>
                       <w:sz w:val="28"/>
                     </w:rPr>
-                    <w:t>Pose 相等比较辅助代码移至独立的头文件和源文件；运行结果为 14 tests、14 passed。</w:t>
+                    <w:t>修改内容：加入 ICommand 接口及虚函数 DoOperate，三个指令类实现该接口，Execute 通过接口指针调用指令对象。同时把测试所用的 Pose 相等比较声明放入 tests/PoseEq.hpp，把定义放入 tests/PoseEq.cpp，再重新构建项目。</w:t>
                   </w:r>
                 </w:p>
                 <w:p>
                   <w:pPr>
-                    <w:spacing w:after="240"/>
+                    <w:spacing w:after="120" w:line="288" w:lineRule="auto"/>
+                    <w:jc w:val="left"/>
+                  </w:pPr>
+                  <w:r>
+                    <w:rPr>
+                      <w:rFonts w:ascii="宋体" w:hAnsi="宋体" w:eastAsia="宋体"/>
+                      <w:b w:val="0"/>
+                      <w:sz w:val="28"/>
+                    </w:rPr>
+                    <w:t>结果分析：图中逐项列出 Test01 至 Test14 的场景，末尾显示“14 tests”和“14 passed”，退出码为 0。初始位姿、单步移动、转向和组合命令均保持通过，说明文件拆分及多态分派没有破坏原有行为。此时还没有加入 F 用例，因此总数为 14。对应版本为 exp2-14pass（e16f42f）。</w:t>
+                  </w:r>
+                </w:p>
+                <w:p>
+                  <w:pPr>
+                    <w:spacing w:after="160"/>
                     <w:jc w:val="center"/>
                   </w:pPr>
                   <w:r>
                     <w:drawing>
                       <wp:inline xmlns:a="http://schemas.openxmlformats.org/drawingml/2006/main" xmlns:pic="http://schemas.openxmlformats.org/drawingml/2006/picture">
-                        <wp:extent cx="4709160" cy="2943570"/>
+                        <wp:extent cx="4800600" cy="3000727"/>
                         <wp:docPr id="3" name="Picture 3"/>
                         <wp:cNvGraphicFramePr>
                           <a:graphicFrameLocks noChangeAspect="1"/>
@@ -1447,7 +1515,7 @@
                               <pic:spPr>
                                 <a:xfrm>
                                   <a:off x="0" y="0"/>
-                                  <a:ext cx="4709160" cy="2943570"/>
+                                  <a:ext cx="4800600" cy="3000727"/>
                                 </a:xfrm>
                                 <a:prstGeom prst="rect"/>
                               </pic:spPr>
@@ -1481,7 +1549,7 @@
                 </w:tcPr>
                 <w:p>
                   <w:pPr>
-                    <w:spacing w:after="120"/>
+                    <w:spacing w:after="160"/>
                     <w:jc w:val="center"/>
                   </w:pPr>
                   <w:r>
@@ -1495,8 +1563,8 @@
                 </w:p>
                 <w:p>
                   <w:pPr>
-                    <w:spacing w:after="120"/>
-                    <w:jc w:val="center"/>
+                    <w:spacing w:after="120" w:line="288" w:lineRule="auto"/>
+                    <w:jc w:val="left"/>
                   </w:pPr>
                   <w:r>
                     <w:rPr>
@@ -1504,18 +1572,32 @@
                       <w:b w:val="0"/>
                       <w:sz w:val="28"/>
                     </w:rPr>
-                    <w:t>实现 F 之前，FM、FL、FR 及 FFM 后再次 FM 四项用例均未满足预期，运行结果为 4 failed。这明确了待实现的行为。</w:t>
+                    <w:t>用例设计：Fast01 输入 FM，要求面向东时前进两格；Fast02 输入 FL，要求先前进一步再左转；Fast03 输入 FR，要求先前进一步再右转；Fast04 先用 FFM 关闭加速，再用 FM 验证再次开启，最终 y 应为 3。四项分别检查 F 对前进、转向和状态切换的影响。</w:t>
                   </w:r>
                 </w:p>
                 <w:p>
                   <w:pPr>
-                    <w:spacing w:after="240"/>
+                    <w:spacing w:after="120" w:line="288" w:lineRule="auto"/>
+                    <w:jc w:val="left"/>
+                  </w:pPr>
+                  <w:r>
+                    <w:rPr>
+                      <w:rFonts w:ascii="宋体" w:hAnsi="宋体" w:eastAsia="宋体"/>
+                      <w:b w:val="0"/>
+                      <w:sz w:val="28"/>
+                    </w:rPr>
+                    <w:t>运行观察：此时尚未编写 F 的执行代码。只运行 Fast* 用例，四项均未达到预期：前三项的实际坐标少一步，第四项实际 y 为 2 而非 3。截图保留了各用例说明、实际值和“4 tests”汇总，为下一步修改提供了明确目标。对应版本为 exp2-fail（0149b28）。</w:t>
+                  </w:r>
+                </w:p>
+                <w:p>
+                  <w:pPr>
+                    <w:spacing w:after="160"/>
                     <w:jc w:val="center"/>
                   </w:pPr>
                   <w:r>
                     <w:drawing>
                       <wp:inline xmlns:a="http://schemas.openxmlformats.org/drawingml/2006/main" xmlns:pic="http://schemas.openxmlformats.org/drawingml/2006/picture">
-                        <wp:extent cx="4709160" cy="2943570"/>
+                        <wp:extent cx="4800600" cy="3000727"/>
                         <wp:docPr id="4" name="Picture 4"/>
                         <wp:cNvGraphicFramePr>
                           <a:graphicFrameLocks noChangeAspect="1"/>
@@ -1536,7 +1618,7 @@
                               <pic:spPr>
                                 <a:xfrm>
                                   <a:off x="0" y="0"/>
-                                  <a:ext cx="4709160" cy="2943570"/>
+                                  <a:ext cx="4800600" cy="3000727"/>
                                 </a:xfrm>
                                 <a:prstGeom prst="rect"/>
                               </pic:spPr>
@@ -1570,7 +1652,7 @@
                 </w:tcPr>
                 <w:p>
                   <w:pPr>
-                    <w:spacing w:after="120"/>
+                    <w:spacing w:after="160"/>
                     <w:jc w:val="center"/>
                   </w:pPr>
                   <w:r>
@@ -1584,8 +1666,8 @@
                 </w:p>
                 <w:p>
                   <w:pPr>
-                    <w:spacing w:after="120"/>
-                    <w:jc w:val="center"/>
+                    <w:spacing w:after="120" w:line="288" w:lineRule="auto"/>
+                    <w:jc w:val="left"/>
                   </w:pPr>
                   <w:r>
                     <w:rPr>
@@ -1593,18 +1675,32 @@
                       <w:b w:val="0"/>
                       <w:sz w:val="28"/>
                     </w:rPr>
-                    <w:t>F 可切换状态；加速时 M 前进两格，L/R 先前进一步再转向。运行结果为 18 tests、18 passed，CTest 也通过。</w:t>
+                    <w:t>实现内容：在 ExecutorImpl 中加入初始为 false 的 fast 状态，FastCommand 每执行一次就切换该状态。普通状态下 M、L、R 沿用原有规则；加速状态下 M 连续前进两格，L/R 先前进一步再转向。状态保存在执行器对象内，因此连续两次 Execute 调用之间仍能延续。</w:t>
                   </w:r>
                 </w:p>
                 <w:p>
                   <w:pPr>
-                    <w:spacing w:after="240"/>
+                    <w:spacing w:after="120" w:line="288" w:lineRule="auto"/>
+                    <w:jc w:val="left"/>
+                  </w:pPr>
+                  <w:r>
+                    <w:rPr>
+                      <w:rFonts w:ascii="宋体" w:hAnsi="宋体" w:eastAsia="宋体"/>
+                      <w:b w:val="0"/>
+                      <w:sz w:val="28"/>
+                    </w:rPr>
+                    <w:t>结果分析：图中依次打印原有 14 项和新增 4 项的测试说明，末尾显示“18 tests”“18 passed”，退出码为 0；CTest 运行结果同样通过。与图 4 对照，F 的四项用例由不满足预期变为全部通过，旧用例也继续通过。对应版本为 exp2-final（636da36）。</w:t>
+                  </w:r>
+                </w:p>
+                <w:p>
+                  <w:pPr>
+                    <w:spacing w:after="160"/>
                     <w:jc w:val="center"/>
                   </w:pPr>
                   <w:r>
                     <w:drawing>
                       <wp:inline xmlns:a="http://schemas.openxmlformats.org/drawingml/2006/main" xmlns:pic="http://schemas.openxmlformats.org/drawingml/2006/picture">
-                        <wp:extent cx="4709160" cy="2943570"/>
+                        <wp:extent cx="4800600" cy="3000727"/>
                         <wp:docPr id="5" name="Picture 5"/>
                         <wp:cNvGraphicFramePr>
                           <a:graphicFrameLocks noChangeAspect="1"/>
@@ -1625,7 +1721,7 @@
                               <pic:spPr>
                                 <a:xfrm>
                                   <a:off x="0" y="0"/>
-                                  <a:ext cx="4709160" cy="2943570"/>
+                                  <a:ext cx="4800600" cy="3000727"/>
                                 </a:xfrm>
                                 <a:prstGeom prst="rect"/>
                               </pic:spPr>
@@ -1640,6 +1736,19 @@
             </w:tr>
           </w:tbl>
           <w:p/>
+          <w:p>
+            <w:pPr>
+              <w:spacing w:after="120" w:line="300" w:lineRule="auto"/>
+            </w:pPr>
+            <w:r>
+              <w:rPr>
+                <w:rFonts w:ascii="宋体" w:hAnsi="宋体" w:eastAsia="宋体"/>
+                <w:b w:val="0"/>
+                <w:sz w:val="28"/>
+              </w:rPr>
+              <w:t>综合五个阶段的结果，前 14 项用例在每次结构调整后保持通过；新增 F 用例先指出缺少的行为，实现后与原有用例合计 18 项全部通过。截图与各阶段提交相对应，可据此复查修改顺序和运行结果。</w:t>
+            </w:r>
+          </w:p>
         </w:tc>
       </w:tr>
       <w:tr>

</xml_diff>

<commit_message>
docs: replace code structure shots with VS Code views
</commit_message>
<xml_diff>
--- a/docs/experiment2/实验2报告_标准模板版.docx
+++ b/docs/experiment2/实验2报告_标准模板版.docx
@@ -1205,7 +1205,7 @@
                 <w:b w:val="0"/>
                 <w:sz w:val="28"/>
               </w:rPr>
-              <w:t>以下五张图按 Git 版本的先后顺序排列。前两张记录代码结构的变化，第三张核对原有用例，最后两张对照 F 指令实现前后的运行结果。每一步都在前一步的基础上完成，便于检查哪次修改引起了测试结果变化。</w:t>
+              <w:t>以下五张图按 Git 版本的先后顺序排列。图 1、图 2 是 VS Code 中打开对应 Git 版本源码的编辑器截图；图 3 至图 5 是测试结果的终端截图。第三张核对原有用例，最后两张对照 F 指令实现前后的运行结果。每一步都在前一步的基础上完成，便于检查哪次修改引起了测试结果变化。</w:t>
             </w:r>
           </w:p>
           <w:p>
@@ -1218,7 +1218,7 @@
                 <w:b w:val="0"/>
                 <w:sz w:val="28"/>
               </w:rPr>
-              <w:t>原有 14 项用例覆盖初始位姿、四个方向的前进、左右转向、组合命令和空命令。新增 4 项用例分别检查加速前进、加速左转、加速右转以及 F 的关闭与再次开启。下文结合截图说明代码与测试结果。</w:t>
+              <w:t>原有 14 项覆盖初始位姿、四向前进、转向、组合命令和空命令；新增 4 项检查加速前进、加速转向以及 F 的关闭与再次开启。</w:t>
             </w:r>
           </w:p>
           <w:tbl>
@@ -1249,7 +1249,7 @@
                       <w:b/>
                       <w:sz w:val="28"/>
                     </w:rPr>
-                    <w:t>图 1  函数抽取后的代码结构</w:t>
+                    <w:t>图 1  VS Code 中的函数抽取代码</w:t>
                   </w:r>
                 </w:p>
                 <w:p>
@@ -1263,7 +1263,7 @@
                       <w:b w:val="0"/>
                       <w:sz w:val="28"/>
                     </w:rPr>
-                    <w:t>修改内容：把原来写在 Execute 中的坐标变化和方向变化分别移入 Move、TurnLeft、TurnRight。Move 根据朝向改变 x 或 y；两个转向函数只改变 heading。Execute 保留对 M、L、R 的识别，再调用对应方法。图中可看到头文件里的三个声明及 Execute 的调用位置。</w:t>
+                    <w:t>修改内容：把原来写在 Execute 中的坐标变化和方向变化分别移入 Move、TurnLeft、TurnRight。Move 根据朝向改变 x 或 y；两个转向函数只改变 heading。Execute 保留对 M、L、R 的识别，再调用对应方法。图中显示 Execute 对三个方法的调用，以及下方 Move 的 switch 实现开头；对应声明位于 ExecutorImpl.hpp。</w:t>
                   </w:r>
                 </w:p>
                 <w:p>
@@ -1352,7 +1352,7 @@
                       <w:b/>
                       <w:sz w:val="28"/>
                     </w:rPr>
-                    <w:t>图 2  类实现后的代码结构</w:t>
+                    <w:t>图 2  VS Code 中的指令类代码</w:t>
                   </w:r>
                 </w:p>
                 <w:p>
@@ -1366,7 +1366,7 @@
                       <w:b w:val="0"/>
                       <w:sz w:val="28"/>
                     </w:rPr>
-                    <w:t>修改内容：增加 MoveCommand、TurnLeftCommand、TurnRightCommand 三个类。每个类都提供 DoOperate，并在函数中调用对应的 Move、TurnLeft 或 TurnRight；Execute 根据读到的字符创建相应对象并执行操作。图中三个类的定义与下方的分派代码相互对应。</w:t>
+                    <w:t>修改内容：增加 MoveCommand、TurnLeftCommand、TurnRightCommand 三个类。每个类都提供 DoOperate，并在函数中调用对应的 Move、TurnLeft 或 TurnRight；Execute 根据读到的字符创建相应对象并执行操作。图中展示 ExecutorImpl.hpp 里的三个类及各自的 DoOperate；分派逻辑写在 ExecutorImpl.cpp 中。</w:t>
                   </w:r>
                 </w:p>
                 <w:p>

</xml_diff>